<commit_message>
refactor: flatten /tma routes to root level
Remove redundant /tma prefix — the app IS the app, no parent needed.
Routes: /tma/* → /*, /tma/casos → /casos, /tma/casos/nuevo → /casos/nuevo,
/tma/contratos → /contratos. Middleware simplified to protect everything
except /login and /register. Auth redirects updated to '/'.
All 82 tests updated and passing.

Co-Authored-By: Claude Sonnet 4.6 <noreply@anthropic.com>
</commit_message>
<xml_diff>
--- a/tma/templates/AC PF.docx
+++ b/tma/templates/AC PF.docx
@@ -1,6 +1,6 @@
 
 <file path=word/document.xml><?xml version="1.0" encoding="utf-8"?>
-<w:document xmlns:wpc="http://schemas.microsoft.com/office/word/2010/wordprocessingCanvas" xmlns:cx="http://schemas.microsoft.com/office/drawing/2014/chartex" xmlns:cx1="http://schemas.microsoft.com/office/drawing/2015/9/8/chartex" xmlns:cx2="http://schemas.microsoft.com/office/drawing/2015/10/21/chartex" xmlns:cx3="http://schemas.microsoft.com/office/drawing/2016/5/9/chartex" xmlns:cx4="http://schemas.microsoft.com/office/drawing/2016/5/10/chartex" xmlns:cx5="http://schemas.microsoft.com/office/drawing/2016/5/11/chartex" xmlns:cx6="http://schemas.microsoft.com/office/drawing/2016/5/12/chartex" xmlns:cx7="http://schemas.microsoft.com/office/drawing/2016/5/13/chartex" xmlns:cx8="http://schemas.microsoft.com/office/drawing/2016/5/14/chartex" xmlns:mc="http://schemas.openxmlformats.org/markup-compatibility/2006" xmlns:aink="http://schemas.microsoft.com/office/drawing/2016/ink" xmlns:am3d="http://schemas.microsoft.com/office/drawing/2017/model3d" xmlns:o="urn:schemas-microsoft-com:office:office" xmlns:oel="http://schemas.microsoft.com/office/2019/extlst" xmlns:r="http://schemas.openxmlformats.org/officeDocument/2006/relationships" xmlns:m="http://schemas.openxmlformats.org/officeDocument/2006/math" xmlns:v="urn:schemas-microsoft-com:vml" xmlns:wp14="http://schemas.microsoft.com/office/word/2010/wordprocessingDrawing" xmlns:wp="http://schemas.openxmlformats.org/drawingml/2006/wordprocessingDrawing" xmlns:w10="urn:schemas-microsoft-com:office:word" xmlns:w="http://schemas.openxmlformats.org/wordprocessingml/2006/main" xmlns:w14="http://schemas.microsoft.com/office/word/2010/wordml" xmlns:w15="http://schemas.microsoft.com/office/word/2012/wordml" xmlns:w16cex="http://schemas.microsoft.com/office/word/2018/wordml/cex" xmlns:w16cid="http://schemas.microsoft.com/office/word/2016/wordml/cid" xmlns:w16="http://schemas.microsoft.com/office/word/2018/wordml" xmlns:w16du="http://schemas.microsoft.com/office/word/2023/wordml/word16du" xmlns:w16sdtdh="http://schemas.microsoft.com/office/word/2020/wordml/sdtdatahash" xmlns:w16sdtfl="http://schemas.microsoft.com/office/word/2024/wordml/sdtformatlock" xmlns:w16se="http://schemas.microsoft.com/office/word/2015/wordml/symex" xmlns:wpg="http://schemas.microsoft.com/office/word/2010/wordprocessingGroup" xmlns:wpi="http://schemas.microsoft.com/office/word/2010/wordprocessingInk" xmlns:wne="http://schemas.microsoft.com/office/word/2006/wordml" xmlns:wps="http://schemas.microsoft.com/office/word/2010/wordprocessingShape" mc:Ignorable="w14 w15 w16se w16cid w16 w16cex w16sdtdh w16sdtfl w16du wp14">
+<w:document xmlns:wpc="http://schemas.microsoft.com/office/word/2010/wordprocessingCanvas" xmlns:cx="http://schemas.microsoft.com/office/drawing/2014/chartex" xmlns:cx1="http://schemas.microsoft.com/office/drawing/2015/9/8/chartex" xmlns:mc="http://schemas.openxmlformats.org/markup-compatibility/2006" xmlns:o="urn:schemas-microsoft-com:office:office" xmlns:r="http://schemas.openxmlformats.org/officeDocument/2006/relationships" xmlns:m="http://schemas.openxmlformats.org/officeDocument/2006/math" xmlns:v="urn:schemas-microsoft-com:vml" xmlns:wp14="http://schemas.microsoft.com/office/word/2010/wordprocessingDrawing" xmlns:wp="http://schemas.openxmlformats.org/drawingml/2006/wordprocessingDrawing" xmlns:w10="urn:schemas-microsoft-com:office:word" xmlns:w="http://schemas.openxmlformats.org/wordprocessingml/2006/main" xmlns:w14="http://schemas.microsoft.com/office/word/2010/wordml" xmlns:w15="http://schemas.microsoft.com/office/word/2012/wordml" xmlns:w16se="http://schemas.microsoft.com/office/word/2015/wordml/symex" xmlns:wpg="http://schemas.microsoft.com/office/word/2010/wordprocessingGroup" xmlns:wpi="http://schemas.microsoft.com/office/word/2010/wordprocessingInk" xmlns:wne="http://schemas.microsoft.com/office/word/2006/wordml" xmlns:wps="http://schemas.microsoft.com/office/word/2010/wordprocessingShape" mc:Ignorable="w14 w15 w16se wp14">
   <w:body>
     <w:p>
       <w:pPr>
@@ -14,6 +14,7 @@
         <w:rPr>
           <w:rFonts w:asciiTheme="minorHAnsi" w:hAnsiTheme="minorHAnsi" w:cstheme="minorHAnsi"/>
           <w:noProof/>
+          <w:lang w:val="en-US" w:eastAsia="en-US" w:bidi="ar-SA"/>
         </w:rPr>
         <w:drawing>
           <wp:anchor distT="0" distB="0" distL="114300" distR="114300" simplePos="0" relativeHeight="251659264" behindDoc="1" locked="0" layoutInCell="1" allowOverlap="1" wp14:anchorId="11748093" wp14:editId="64789D33">
@@ -667,6 +668,7 @@
                 <w:rFonts w:asciiTheme="minorHAnsi" w:hAnsiTheme="minorHAnsi" w:cstheme="minorBidi"/>
                 <w:sz w:val="24"/>
                 <w:szCs w:val="24"/>
+                <w:highlight w:val="yellow"/>
               </w:rPr>
             </w:pPr>
             <w:r>
@@ -674,6 +676,7 @@
                 <w:rFonts w:asciiTheme="minorHAnsi" w:hAnsiTheme="minorHAnsi" w:cstheme="minorBidi"/>
                 <w:sz w:val="24"/>
                 <w:szCs w:val="24"/>
+                <w:highlight w:val="yellow"/>
                 <w:u w:val="single"/>
               </w:rPr>
               <w:t xml:space="preserve">Nombre </w:t>
@@ -683,6 +686,7 @@
                 <w:rFonts w:asciiTheme="minorHAnsi" w:hAnsiTheme="minorHAnsi" w:cstheme="minorBidi"/>
                 <w:sz w:val="24"/>
                 <w:szCs w:val="24"/>
+                <w:highlight w:val="yellow"/>
                 <w:u w:val="single"/>
               </w:rPr>
               <w:t>y Apellido:</w:t>
@@ -692,6 +696,7 @@
                 <w:rFonts w:asciiTheme="minorHAnsi" w:hAnsiTheme="minorHAnsi" w:cstheme="minorBidi"/>
                 <w:sz w:val="24"/>
                 <w:szCs w:val="24"/>
+                <w:highlight w:val="yellow"/>
               </w:rPr>
               <w:t xml:space="preserve"> </w:t>
             </w:r>
@@ -709,6 +714,7 @@
                 <w:rFonts w:asciiTheme="minorHAnsi" w:hAnsiTheme="minorHAnsi" w:cstheme="minorBidi"/>
                 <w:sz w:val="24"/>
                 <w:szCs w:val="24"/>
+                <w:highlight w:val="yellow"/>
               </w:rPr>
             </w:pPr>
             <w:r>
@@ -716,6 +722,7 @@
                 <w:rFonts w:asciiTheme="minorHAnsi" w:hAnsiTheme="minorHAnsi" w:cstheme="minorBidi"/>
                 <w:sz w:val="24"/>
                 <w:szCs w:val="24"/>
+                <w:highlight w:val="yellow"/>
                 <w:u w:val="single"/>
               </w:rPr>
               <w:t xml:space="preserve"> Domicilio:</w:t>
@@ -725,6 +732,7 @@
                 <w:rFonts w:asciiTheme="minorHAnsi" w:hAnsiTheme="minorHAnsi" w:cstheme="minorBidi"/>
                 <w:sz w:val="24"/>
                 <w:szCs w:val="24"/>
+                <w:highlight w:val="yellow"/>
               </w:rPr>
               <w:t xml:space="preserve"> </w:t>
             </w:r>
@@ -742,6 +750,7 @@
                 <w:rFonts w:asciiTheme="minorHAnsi" w:hAnsiTheme="minorHAnsi" w:cstheme="minorBidi"/>
                 <w:sz w:val="24"/>
                 <w:szCs w:val="24"/>
+                <w:highlight w:val="yellow"/>
               </w:rPr>
             </w:pPr>
             <w:r>
@@ -749,6 +758,7 @@
                 <w:rFonts w:asciiTheme="minorHAnsi" w:hAnsiTheme="minorHAnsi" w:cstheme="minorBidi"/>
                 <w:sz w:val="24"/>
                 <w:szCs w:val="24"/>
+                <w:highlight w:val="yellow"/>
                 <w:u w:val="single"/>
               </w:rPr>
               <w:t>Ciudad:</w:t>
@@ -758,6 +768,7 @@
                 <w:rFonts w:asciiTheme="minorHAnsi" w:hAnsiTheme="minorHAnsi" w:cstheme="minorBidi"/>
                 <w:sz w:val="24"/>
                 <w:szCs w:val="24"/>
+                <w:highlight w:val="yellow"/>
               </w:rPr>
               <w:t xml:space="preserve"> </w:t>
             </w:r>
@@ -775,6 +786,7 @@
                 <w:rFonts w:asciiTheme="minorHAnsi" w:hAnsiTheme="minorHAnsi" w:cstheme="minorBidi"/>
                 <w:sz w:val="24"/>
                 <w:szCs w:val="24"/>
+                <w:highlight w:val="yellow"/>
               </w:rPr>
             </w:pPr>
             <w:r>
@@ -782,6 +794,7 @@
                 <w:rFonts w:asciiTheme="minorHAnsi" w:hAnsiTheme="minorHAnsi" w:cstheme="minorBidi"/>
                 <w:sz w:val="24"/>
                 <w:szCs w:val="24"/>
+                <w:highlight w:val="yellow"/>
                 <w:u w:val="single"/>
               </w:rPr>
               <w:t>País:</w:t>
@@ -791,6 +804,7 @@
                 <w:rFonts w:asciiTheme="minorHAnsi" w:hAnsiTheme="minorHAnsi" w:cstheme="minorBidi"/>
                 <w:sz w:val="24"/>
                 <w:szCs w:val="24"/>
+                <w:highlight w:val="yellow"/>
               </w:rPr>
               <w:t xml:space="preserve"> </w:t>
             </w:r>
@@ -808,6 +822,7 @@
                 <w:rFonts w:asciiTheme="minorHAnsi" w:hAnsiTheme="minorHAnsi" w:cstheme="minorBidi"/>
                 <w:sz w:val="24"/>
                 <w:szCs w:val="24"/>
+                <w:highlight w:val="yellow"/>
               </w:rPr>
             </w:pPr>
             <w:r>
@@ -815,6 +830,7 @@
                 <w:rFonts w:asciiTheme="minorHAnsi" w:hAnsiTheme="minorHAnsi" w:cstheme="minorBidi"/>
                 <w:sz w:val="24"/>
                 <w:szCs w:val="24"/>
+                <w:highlight w:val="yellow"/>
                 <w:u w:val="single"/>
               </w:rPr>
               <w:t>Código Postal:</w:t>
@@ -824,6 +840,7 @@
                 <w:rFonts w:asciiTheme="minorHAnsi" w:hAnsiTheme="minorHAnsi" w:cstheme="minorBidi"/>
                 <w:sz w:val="24"/>
                 <w:szCs w:val="24"/>
+                <w:highlight w:val="yellow"/>
               </w:rPr>
               <w:t xml:space="preserve"> </w:t>
             </w:r>
@@ -841,6 +858,7 @@
                 <w:rFonts w:asciiTheme="minorHAnsi" w:hAnsiTheme="minorHAnsi" w:cstheme="minorBidi"/>
                 <w:sz w:val="24"/>
                 <w:szCs w:val="24"/>
+                <w:highlight w:val="yellow"/>
               </w:rPr>
             </w:pPr>
             <w:r>
@@ -848,6 +866,7 @@
                 <w:rFonts w:asciiTheme="minorHAnsi" w:hAnsiTheme="minorHAnsi" w:cstheme="minorBidi"/>
                 <w:sz w:val="24"/>
                 <w:szCs w:val="24"/>
+                <w:highlight w:val="yellow"/>
                 <w:u w:val="single"/>
               </w:rPr>
               <w:t>Número de t</w:t>
@@ -857,6 +876,7 @@
                 <w:rFonts w:asciiTheme="minorHAnsi" w:hAnsiTheme="minorHAnsi" w:cstheme="minorBidi"/>
                 <w:sz w:val="24"/>
                 <w:szCs w:val="24"/>
+                <w:highlight w:val="yellow"/>
                 <w:u w:val="single"/>
               </w:rPr>
               <w:t>eléfono:</w:t>
@@ -866,6 +886,7 @@
                 <w:rFonts w:asciiTheme="minorHAnsi" w:hAnsiTheme="minorHAnsi" w:cstheme="minorBidi"/>
                 <w:sz w:val="24"/>
                 <w:szCs w:val="24"/>
+                <w:highlight w:val="yellow"/>
               </w:rPr>
               <w:t xml:space="preserve"> </w:t>
             </w:r>
@@ -883,6 +904,7 @@
                 <w:rFonts w:asciiTheme="minorHAnsi" w:hAnsiTheme="minorHAnsi" w:cstheme="minorBidi"/>
                 <w:sz w:val="24"/>
                 <w:szCs w:val="24"/>
+                <w:highlight w:val="yellow"/>
               </w:rPr>
             </w:pPr>
             <w:r>
@@ -890,6 +912,7 @@
                 <w:rFonts w:asciiTheme="minorHAnsi" w:hAnsiTheme="minorHAnsi" w:cstheme="minorBidi"/>
                 <w:sz w:val="24"/>
                 <w:szCs w:val="24"/>
+                <w:highlight w:val="yellow"/>
                 <w:u w:val="single"/>
               </w:rPr>
               <w:t>Dirección de c</w:t>
@@ -899,6 +922,7 @@
                 <w:rFonts w:asciiTheme="minorHAnsi" w:hAnsiTheme="minorHAnsi" w:cstheme="minorBidi"/>
                 <w:sz w:val="24"/>
                 <w:szCs w:val="24"/>
+                <w:highlight w:val="yellow"/>
                 <w:u w:val="single"/>
               </w:rPr>
               <w:t>orreo electrónico:</w:t>
@@ -908,6 +932,7 @@
                 <w:rFonts w:asciiTheme="minorHAnsi" w:hAnsiTheme="minorHAnsi" w:cstheme="minorBidi"/>
                 <w:sz w:val="24"/>
                 <w:szCs w:val="24"/>
+                <w:highlight w:val="yellow"/>
               </w:rPr>
               <w:t xml:space="preserve"> </w:t>
             </w:r>
@@ -925,6 +950,7 @@
                 <w:rFonts w:asciiTheme="minorHAnsi" w:hAnsiTheme="minorHAnsi" w:cstheme="minorBidi"/>
                 <w:sz w:val="24"/>
                 <w:szCs w:val="24"/>
+                <w:highlight w:val="yellow"/>
               </w:rPr>
             </w:pPr>
             <w:r>
@@ -932,6 +958,7 @@
                 <w:rFonts w:asciiTheme="minorHAnsi" w:hAnsiTheme="minorHAnsi" w:cstheme="minorBidi"/>
                 <w:sz w:val="24"/>
                 <w:szCs w:val="24"/>
+                <w:highlight w:val="yellow"/>
                 <w:u w:val="single"/>
               </w:rPr>
               <w:t>DNI/C</w:t>
@@ -941,6 +968,7 @@
                 <w:rFonts w:asciiTheme="minorHAnsi" w:hAnsiTheme="minorHAnsi" w:cstheme="minorBidi"/>
                 <w:sz w:val="24"/>
                 <w:szCs w:val="24"/>
+                <w:highlight w:val="yellow"/>
                 <w:u w:val="single"/>
               </w:rPr>
               <w:t>UIT:</w:t>
@@ -950,6 +978,7 @@
                 <w:rFonts w:asciiTheme="minorHAnsi" w:hAnsiTheme="minorHAnsi" w:cstheme="minorBidi"/>
                 <w:sz w:val="24"/>
                 <w:szCs w:val="24"/>
+                <w:highlight w:val="yellow"/>
               </w:rPr>
               <w:t xml:space="preserve"> </w:t>
             </w:r>
@@ -964,6 +993,8 @@
                 <w:szCs w:val="24"/>
               </w:rPr>
             </w:pPr>
+            <w:bookmarkStart w:id="0" w:name="_GoBack"/>
+            <w:bookmarkEnd w:id="0"/>
           </w:p>
         </w:tc>
       </w:tr>
@@ -3567,43 +3598,7 @@
           <w:sz w:val="24"/>
           <w:szCs w:val="24"/>
         </w:rPr>
-        <w:t xml:space="preserve"> a fin de influir en actuaciones de la autoridad o institución pública o, de alguna forma, de obtener una ventaja indebida; (</w:t>
-      </w:r>
-      <w:proofErr w:type="spellStart"/>
-      <w:r>
-        <w:rPr>
-          <w:rFonts w:asciiTheme="minorHAnsi" w:hAnsiTheme="minorHAnsi" w:cstheme="minorHAnsi"/>
-          <w:sz w:val="24"/>
-          <w:szCs w:val="24"/>
-        </w:rPr>
-        <w:t>ii</w:t>
-      </w:r>
-      <w:proofErr w:type="spellEnd"/>
-      <w:r>
-        <w:rPr>
-          <w:rFonts w:asciiTheme="minorHAnsi" w:hAnsiTheme="minorHAnsi" w:cstheme="minorHAnsi"/>
-          <w:sz w:val="24"/>
-          <w:szCs w:val="24"/>
-        </w:rPr>
-        <w:t>) cualquier otra persona, teniendo conocimiento de que todo o parte del dinero u objeto de valor será ofrecido o entregado a un Funcionario Público para influir en actuaciones de la autoridad o institución pública o, de alguna forma, obtener una ventaja indebida, o (</w:t>
-      </w:r>
-      <w:proofErr w:type="spellStart"/>
-      <w:r>
-        <w:rPr>
-          <w:rFonts w:asciiTheme="minorHAnsi" w:hAnsiTheme="minorHAnsi" w:cstheme="minorHAnsi"/>
-          <w:sz w:val="24"/>
-          <w:szCs w:val="24"/>
-        </w:rPr>
-        <w:t>iii</w:t>
-      </w:r>
-      <w:proofErr w:type="spellEnd"/>
-      <w:r>
-        <w:rPr>
-          <w:rFonts w:asciiTheme="minorHAnsi" w:hAnsiTheme="minorHAnsi" w:cstheme="minorHAnsi"/>
-          <w:sz w:val="24"/>
-          <w:szCs w:val="24"/>
-        </w:rPr>
-        <w:t>) a cualquier otra persona, a fin de inducirle a actuar de manera desleal o, de cualquier modo, inapropiada;</w:t>
+        <w:t xml:space="preserve"> a fin de influir en actuaciones de la autoridad o institución pública o, de alguna forma, de obtener una ventaja indebida; (ii) cualquier otra persona, teniendo conocimiento de que todo o parte del dinero u objeto de valor será ofrecido o entregado a un Funcionario Público para influir en actuaciones de la autoridad o institución pública o, de alguna forma, obtener una ventaja indebida, o (iii) a cualquier otra persona, a fin de inducirle a actuar de manera desleal o, de cualquier modo, inapropiada;</w:t>
       </w:r>
     </w:p>
     <w:p>
@@ -4109,7 +4104,7 @@
 </file>
 
 <file path=word/endnotes.xml><?xml version="1.0" encoding="utf-8"?>
-<w:endnotes xmlns:wpc="http://schemas.microsoft.com/office/word/2010/wordprocessingCanvas" xmlns:cx="http://schemas.microsoft.com/office/drawing/2014/chartex" xmlns:cx1="http://schemas.microsoft.com/office/drawing/2015/9/8/chartex" xmlns:cx2="http://schemas.microsoft.com/office/drawing/2015/10/21/chartex" xmlns:cx3="http://schemas.microsoft.com/office/drawing/2016/5/9/chartex" xmlns:cx4="http://schemas.microsoft.com/office/drawing/2016/5/10/chartex" xmlns:cx5="http://schemas.microsoft.com/office/drawing/2016/5/11/chartex" xmlns:cx6="http://schemas.microsoft.com/office/drawing/2016/5/12/chartex" xmlns:cx7="http://schemas.microsoft.com/office/drawing/2016/5/13/chartex" xmlns:cx8="http://schemas.microsoft.com/office/drawing/2016/5/14/chartex" xmlns:mc="http://schemas.openxmlformats.org/markup-compatibility/2006" xmlns:aink="http://schemas.microsoft.com/office/drawing/2016/ink" xmlns:am3d="http://schemas.microsoft.com/office/drawing/2017/model3d" xmlns:o="urn:schemas-microsoft-com:office:office" xmlns:oel="http://schemas.microsoft.com/office/2019/extlst" xmlns:r="http://schemas.openxmlformats.org/officeDocument/2006/relationships" xmlns:m="http://schemas.openxmlformats.org/officeDocument/2006/math" xmlns:v="urn:schemas-microsoft-com:vml" xmlns:wp14="http://schemas.microsoft.com/office/word/2010/wordprocessingDrawing" xmlns:wp="http://schemas.openxmlformats.org/drawingml/2006/wordprocessingDrawing" xmlns:w10="urn:schemas-microsoft-com:office:word" xmlns:w="http://schemas.openxmlformats.org/wordprocessingml/2006/main" xmlns:w14="http://schemas.microsoft.com/office/word/2010/wordml" xmlns:w15="http://schemas.microsoft.com/office/word/2012/wordml" xmlns:w16cex="http://schemas.microsoft.com/office/word/2018/wordml/cex" xmlns:w16cid="http://schemas.microsoft.com/office/word/2016/wordml/cid" xmlns:w16="http://schemas.microsoft.com/office/word/2018/wordml" xmlns:w16du="http://schemas.microsoft.com/office/word/2023/wordml/word16du" xmlns:w16sdtdh="http://schemas.microsoft.com/office/word/2020/wordml/sdtdatahash" xmlns:w16sdtfl="http://schemas.microsoft.com/office/word/2024/wordml/sdtformatlock" xmlns:w16se="http://schemas.microsoft.com/office/word/2015/wordml/symex" xmlns:wpg="http://schemas.microsoft.com/office/word/2010/wordprocessingGroup" xmlns:wpi="http://schemas.microsoft.com/office/word/2010/wordprocessingInk" xmlns:wne="http://schemas.microsoft.com/office/word/2006/wordml" xmlns:wps="http://schemas.microsoft.com/office/word/2010/wordprocessingShape" mc:Ignorable="w14 w15 w16se w16cid w16 w16cex w16sdtdh w16sdtfl w16du wp14">
+<w:endnotes xmlns:wpc="http://schemas.microsoft.com/office/word/2010/wordprocessingCanvas" xmlns:cx="http://schemas.microsoft.com/office/drawing/2014/chartex" xmlns:cx1="http://schemas.microsoft.com/office/drawing/2015/9/8/chartex" xmlns:mc="http://schemas.openxmlformats.org/markup-compatibility/2006" xmlns:o="urn:schemas-microsoft-com:office:office" xmlns:r="http://schemas.openxmlformats.org/officeDocument/2006/relationships" xmlns:m="http://schemas.openxmlformats.org/officeDocument/2006/math" xmlns:v="urn:schemas-microsoft-com:vml" xmlns:wp14="http://schemas.microsoft.com/office/word/2010/wordprocessingDrawing" xmlns:wp="http://schemas.openxmlformats.org/drawingml/2006/wordprocessingDrawing" xmlns:w10="urn:schemas-microsoft-com:office:word" xmlns:w="http://schemas.openxmlformats.org/wordprocessingml/2006/main" xmlns:w14="http://schemas.microsoft.com/office/word/2010/wordml" xmlns:w15="http://schemas.microsoft.com/office/word/2012/wordml" xmlns:w16se="http://schemas.microsoft.com/office/word/2015/wordml/symex" xmlns:wpg="http://schemas.microsoft.com/office/word/2010/wordprocessingGroup" xmlns:wpi="http://schemas.microsoft.com/office/word/2010/wordprocessingInk" xmlns:wne="http://schemas.microsoft.com/office/word/2006/wordml" xmlns:wps="http://schemas.microsoft.com/office/word/2010/wordprocessingShape" mc:Ignorable="w14 w15 w16se wp14">
   <w:endnote w:type="separator" w:id="-1">
     <w:p>
       <w:r>
@@ -4131,7 +4126,7 @@
 </file>
 
 <file path=word/footer1.xml><?xml version="1.0" encoding="utf-8"?>
-<w:ftr xmlns:wpc="http://schemas.microsoft.com/office/word/2010/wordprocessingCanvas" xmlns:cx="http://schemas.microsoft.com/office/drawing/2014/chartex" xmlns:cx1="http://schemas.microsoft.com/office/drawing/2015/9/8/chartex" xmlns:cx2="http://schemas.microsoft.com/office/drawing/2015/10/21/chartex" xmlns:cx3="http://schemas.microsoft.com/office/drawing/2016/5/9/chartex" xmlns:cx4="http://schemas.microsoft.com/office/drawing/2016/5/10/chartex" xmlns:cx5="http://schemas.microsoft.com/office/drawing/2016/5/11/chartex" xmlns:cx6="http://schemas.microsoft.com/office/drawing/2016/5/12/chartex" xmlns:cx7="http://schemas.microsoft.com/office/drawing/2016/5/13/chartex" xmlns:cx8="http://schemas.microsoft.com/office/drawing/2016/5/14/chartex" xmlns:mc="http://schemas.openxmlformats.org/markup-compatibility/2006" xmlns:aink="http://schemas.microsoft.com/office/drawing/2016/ink" xmlns:am3d="http://schemas.microsoft.com/office/drawing/2017/model3d" xmlns:o="urn:schemas-microsoft-com:office:office" xmlns:oel="http://schemas.microsoft.com/office/2019/extlst" xmlns:r="http://schemas.openxmlformats.org/officeDocument/2006/relationships" xmlns:m="http://schemas.openxmlformats.org/officeDocument/2006/math" xmlns:v="urn:schemas-microsoft-com:vml" xmlns:wp14="http://schemas.microsoft.com/office/word/2010/wordprocessingDrawing" xmlns:wp="http://schemas.openxmlformats.org/drawingml/2006/wordprocessingDrawing" xmlns:w10="urn:schemas-microsoft-com:office:word" xmlns:w="http://schemas.openxmlformats.org/wordprocessingml/2006/main" xmlns:w14="http://schemas.microsoft.com/office/word/2010/wordml" xmlns:w15="http://schemas.microsoft.com/office/word/2012/wordml" xmlns:w16cex="http://schemas.microsoft.com/office/word/2018/wordml/cex" xmlns:w16cid="http://schemas.microsoft.com/office/word/2016/wordml/cid" xmlns:w16="http://schemas.microsoft.com/office/word/2018/wordml" xmlns:w16du="http://schemas.microsoft.com/office/word/2023/wordml/word16du" xmlns:w16sdtdh="http://schemas.microsoft.com/office/word/2020/wordml/sdtdatahash" xmlns:w16sdtfl="http://schemas.microsoft.com/office/word/2024/wordml/sdtformatlock" xmlns:w16se="http://schemas.microsoft.com/office/word/2015/wordml/symex" xmlns:wpg="http://schemas.microsoft.com/office/word/2010/wordprocessingGroup" xmlns:wpi="http://schemas.microsoft.com/office/word/2010/wordprocessingInk" xmlns:wne="http://schemas.microsoft.com/office/word/2006/wordml" xmlns:wps="http://schemas.microsoft.com/office/word/2010/wordprocessingShape" mc:Ignorable="w14 w15 w16se w16cid w16 w16cex w16sdtdh w16sdtfl w16du wp14">
+<w:ftr xmlns:wpc="http://schemas.microsoft.com/office/word/2010/wordprocessingCanvas" xmlns:cx="http://schemas.microsoft.com/office/drawing/2014/chartex" xmlns:cx1="http://schemas.microsoft.com/office/drawing/2015/9/8/chartex" xmlns:mc="http://schemas.openxmlformats.org/markup-compatibility/2006" xmlns:o="urn:schemas-microsoft-com:office:office" xmlns:r="http://schemas.openxmlformats.org/officeDocument/2006/relationships" xmlns:m="http://schemas.openxmlformats.org/officeDocument/2006/math" xmlns:v="urn:schemas-microsoft-com:vml" xmlns:wp14="http://schemas.microsoft.com/office/word/2010/wordprocessingDrawing" xmlns:wp="http://schemas.openxmlformats.org/drawingml/2006/wordprocessingDrawing" xmlns:w10="urn:schemas-microsoft-com:office:word" xmlns:w="http://schemas.openxmlformats.org/wordprocessingml/2006/main" xmlns:w14="http://schemas.microsoft.com/office/word/2010/wordml" xmlns:w15="http://schemas.microsoft.com/office/word/2012/wordml" xmlns:w16se="http://schemas.microsoft.com/office/word/2015/wordml/symex" xmlns:wpg="http://schemas.microsoft.com/office/word/2010/wordprocessingGroup" xmlns:wpi="http://schemas.microsoft.com/office/word/2010/wordprocessingInk" xmlns:wne="http://schemas.microsoft.com/office/word/2006/wordml" xmlns:wps="http://schemas.microsoft.com/office/word/2010/wordprocessingShape" mc:Ignorable="w14 w15 w16se wp14">
   <w:p>
     <w:pPr>
       <w:pStyle w:val="Piedepgina"/>
@@ -4139,6 +4134,7 @@
     <w:r>
       <w:rPr>
         <w:noProof/>
+        <w:lang w:val="en-US" w:eastAsia="en-US" w:bidi="ar-SA"/>
       </w:rPr>
       <mc:AlternateContent>
         <mc:Choice Requires="wps">
@@ -4157,7 +4153,7 @@
               <wp:docPr id="1347224474" name="Cuadro de texto 2" descr="***Este documento está clasificado como PUBLICO por TELEFÓNICA.&#10;***This document is classified as PUBLIC by TELEFÓNICA.">
                 <a:extLst xmlns:a="http://schemas.openxmlformats.org/drawingml/2006/main">
                   <a:ext uri="{5AE41FA2-C0FF-4470-9BD4-5FADCA87CBE2}">
-                    <aclsh:classification xmlns:aclsh="http://schemas.microsoft.com/office/drawing/2020/classificationShape" classificationOutcomeType="ftr"/>
+                    <aclsh:classification xmlns:aclsh="http://schemas.microsoft.com/office/drawing/2020/classificationShape" xmlns:w16sdtfl="http://schemas.microsoft.com/office/word/2024/wordml/sdtformatlock" xmlns:w16sdtdh="http://schemas.microsoft.com/office/word/2020/wordml/sdtdatahash" xmlns:w16du="http://schemas.microsoft.com/office/word/2023/wordml/word16du" xmlns:w16="http://schemas.microsoft.com/office/word/2018/wordml" xmlns:w16cid="http://schemas.microsoft.com/office/word/2016/wordml/cid" xmlns:w16cex="http://schemas.microsoft.com/office/word/2018/wordml/cex" xmlns:w="http://schemas.openxmlformats.org/wordprocessingml/2006/main" xmlns:w10="urn:schemas-microsoft-com:office:word" xmlns:v="urn:schemas-microsoft-com:vml" xmlns:oel="http://schemas.microsoft.com/office/2019/extlst" xmlns:o="urn:schemas-microsoft-com:office:office" xmlns:am3d="http://schemas.microsoft.com/office/drawing/2017/model3d" xmlns:aink="http://schemas.microsoft.com/office/drawing/2016/ink" xmlns:cx8="http://schemas.microsoft.com/office/drawing/2016/5/14/chartex" xmlns:cx7="http://schemas.microsoft.com/office/drawing/2016/5/13/chartex" xmlns:cx6="http://schemas.microsoft.com/office/drawing/2016/5/12/chartex" xmlns:cx5="http://schemas.microsoft.com/office/drawing/2016/5/11/chartex" xmlns:cx4="http://schemas.microsoft.com/office/drawing/2016/5/10/chartex" xmlns:cx3="http://schemas.microsoft.com/office/drawing/2016/5/9/chartex" xmlns:cx2="http://schemas.microsoft.com/office/drawing/2015/10/21/chartex" xmlns="" classificationOutcomeType="ftr"/>
                   </a:ext>
                 </a:extLst>
               </wp:docPr>
@@ -4235,7 +4231,7 @@
             </wp:anchor>
           </w:drawing>
         </mc:Choice>
-        <mc:Fallback>
+        <mc:Fallback xmlns:w16sdtfl="http://schemas.microsoft.com/office/word/2024/wordml/sdtformatlock" xmlns:w16sdtdh="http://schemas.microsoft.com/office/word/2020/wordml/sdtdatahash" xmlns:w16du="http://schemas.microsoft.com/office/word/2023/wordml/word16du" xmlns:w16="http://schemas.microsoft.com/office/word/2018/wordml" xmlns:w16cid="http://schemas.microsoft.com/office/word/2016/wordml/cid" xmlns:w16cex="http://schemas.microsoft.com/office/word/2018/wordml/cex" xmlns:oel="http://schemas.microsoft.com/office/2019/extlst" xmlns:am3d="http://schemas.microsoft.com/office/drawing/2017/model3d" xmlns:aink="http://schemas.microsoft.com/office/drawing/2016/ink" xmlns:cx8="http://schemas.microsoft.com/office/drawing/2016/5/14/chartex" xmlns:cx7="http://schemas.microsoft.com/office/drawing/2016/5/13/chartex" xmlns:cx6="http://schemas.microsoft.com/office/drawing/2016/5/12/chartex" xmlns:cx5="http://schemas.microsoft.com/office/drawing/2016/5/11/chartex" xmlns:cx4="http://schemas.microsoft.com/office/drawing/2016/5/10/chartex" xmlns:cx3="http://schemas.microsoft.com/office/drawing/2016/5/9/chartex" xmlns:cx2="http://schemas.microsoft.com/office/drawing/2015/10/21/chartex">
           <w:pict>
             <v:shapetype w14:anchorId="3710631C" id="_x0000_t202" coordsize="21600,21600" o:spt="202" path="m,l,21600r21600,l21600,xe">
               <v:stroke joinstyle="miter"/>
@@ -4297,7 +4293,7 @@
 </file>
 
 <file path=word/footer2.xml><?xml version="1.0" encoding="utf-8"?>
-<w:ftr xmlns:wpc="http://schemas.microsoft.com/office/word/2010/wordprocessingCanvas" xmlns:cx="http://schemas.microsoft.com/office/drawing/2014/chartex" xmlns:cx1="http://schemas.microsoft.com/office/drawing/2015/9/8/chartex" xmlns:cx2="http://schemas.microsoft.com/office/drawing/2015/10/21/chartex" xmlns:cx3="http://schemas.microsoft.com/office/drawing/2016/5/9/chartex" xmlns:cx4="http://schemas.microsoft.com/office/drawing/2016/5/10/chartex" xmlns:cx5="http://schemas.microsoft.com/office/drawing/2016/5/11/chartex" xmlns:cx6="http://schemas.microsoft.com/office/drawing/2016/5/12/chartex" xmlns:cx7="http://schemas.microsoft.com/office/drawing/2016/5/13/chartex" xmlns:cx8="http://schemas.microsoft.com/office/drawing/2016/5/14/chartex" xmlns:mc="http://schemas.openxmlformats.org/markup-compatibility/2006" xmlns:aink="http://schemas.microsoft.com/office/drawing/2016/ink" xmlns:am3d="http://schemas.microsoft.com/office/drawing/2017/model3d" xmlns:o="urn:schemas-microsoft-com:office:office" xmlns:oel="http://schemas.microsoft.com/office/2019/extlst" xmlns:r="http://schemas.openxmlformats.org/officeDocument/2006/relationships" xmlns:m="http://schemas.openxmlformats.org/officeDocument/2006/math" xmlns:v="urn:schemas-microsoft-com:vml" xmlns:wp14="http://schemas.microsoft.com/office/word/2010/wordprocessingDrawing" xmlns:wp="http://schemas.openxmlformats.org/drawingml/2006/wordprocessingDrawing" xmlns:w10="urn:schemas-microsoft-com:office:word" xmlns:w="http://schemas.openxmlformats.org/wordprocessingml/2006/main" xmlns:w14="http://schemas.microsoft.com/office/word/2010/wordml" xmlns:w15="http://schemas.microsoft.com/office/word/2012/wordml" xmlns:w16cex="http://schemas.microsoft.com/office/word/2018/wordml/cex" xmlns:w16cid="http://schemas.microsoft.com/office/word/2016/wordml/cid" xmlns:w16="http://schemas.microsoft.com/office/word/2018/wordml" xmlns:w16du="http://schemas.microsoft.com/office/word/2023/wordml/word16du" xmlns:w16sdtdh="http://schemas.microsoft.com/office/word/2020/wordml/sdtdatahash" xmlns:w16sdtfl="http://schemas.microsoft.com/office/word/2024/wordml/sdtformatlock" xmlns:w16se="http://schemas.microsoft.com/office/word/2015/wordml/symex" xmlns:wpg="http://schemas.microsoft.com/office/word/2010/wordprocessingGroup" xmlns:wpi="http://schemas.microsoft.com/office/word/2010/wordprocessingInk" xmlns:wne="http://schemas.microsoft.com/office/word/2006/wordml" xmlns:wps="http://schemas.microsoft.com/office/word/2010/wordprocessingShape" mc:Ignorable="w14 w15 w16se w16cid w16 w16cex w16sdtdh w16sdtfl w16du wp14">
+<w:ftr xmlns:wpc="http://schemas.microsoft.com/office/word/2010/wordprocessingCanvas" xmlns:cx="http://schemas.microsoft.com/office/drawing/2014/chartex" xmlns:cx1="http://schemas.microsoft.com/office/drawing/2015/9/8/chartex" xmlns:mc="http://schemas.openxmlformats.org/markup-compatibility/2006" xmlns:o="urn:schemas-microsoft-com:office:office" xmlns:r="http://schemas.openxmlformats.org/officeDocument/2006/relationships" xmlns:m="http://schemas.openxmlformats.org/officeDocument/2006/math" xmlns:v="urn:schemas-microsoft-com:vml" xmlns:wp14="http://schemas.microsoft.com/office/word/2010/wordprocessingDrawing" xmlns:wp="http://schemas.openxmlformats.org/drawingml/2006/wordprocessingDrawing" xmlns:w10="urn:schemas-microsoft-com:office:word" xmlns:w="http://schemas.openxmlformats.org/wordprocessingml/2006/main" xmlns:w14="http://schemas.microsoft.com/office/word/2010/wordml" xmlns:w15="http://schemas.microsoft.com/office/word/2012/wordml" xmlns:w16se="http://schemas.microsoft.com/office/word/2015/wordml/symex" xmlns:wpg="http://schemas.microsoft.com/office/word/2010/wordprocessingGroup" xmlns:wpi="http://schemas.microsoft.com/office/word/2010/wordprocessingInk" xmlns:wne="http://schemas.microsoft.com/office/word/2006/wordml" xmlns:wps="http://schemas.microsoft.com/office/word/2010/wordprocessingShape" mc:Ignorable="w14 w15 w16se wp14">
   <w:p>
     <w:pPr>
       <w:pStyle w:val="Textoindependiente"/>
@@ -4309,6 +4305,7 @@
     <w:r>
       <w:rPr>
         <w:noProof/>
+        <w:lang w:val="en-US" w:eastAsia="en-US" w:bidi="ar-SA"/>
       </w:rPr>
       <mc:AlternateContent>
         <mc:Choice Requires="wps">
@@ -4383,7 +4380,10 @@
                             <w:fldChar w:fldCharType="separate"/>
                           </w:r>
                           <w:r>
-                            <w:t>3</w:t>
+                            <w:rPr>
+                              <w:noProof/>
+                            </w:rPr>
+                            <w:t>1</w:t>
                           </w:r>
                           <w:r>
                             <w:fldChar w:fldCharType="end"/>
@@ -4412,7 +4412,7 @@
               <v:stroke joinstyle="miter"/>
               <v:path gradientshapeok="t" o:connecttype="rect"/>
             </v:shapetype>
-            <v:shape id="Text Box 1" o:spid="_x0000_s1027" type="#_x0000_t202" style="position:absolute;margin-left:292.9pt;margin-top:775.65pt;width:9.6pt;height:13.05pt;z-index:-251658752;visibility:visible;mso-wrap-style:square;mso-width-percent:0;mso-height-percent:0;mso-wrap-distance-left:9pt;mso-wrap-distance-top:0;mso-wrap-distance-right:9pt;mso-wrap-distance-bottom:0;mso-position-horizontal:absolute;mso-position-horizontal-relative:page;mso-position-vertical:absolute;mso-position-vertical-relative:page;mso-width-percent:0;mso-height-percent:0;mso-width-relative:page;mso-height-relative:page;v-text-anchor:top" o:gfxdata="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" filled="f" stroked="f">
+            <v:shape id="Text Box 1" o:spid="_x0000_s1027" type="#_x0000_t202" style="position:absolute;margin-left:292.9pt;margin-top:775.65pt;width:9.6pt;height:13.05pt;z-index:-251658752;visibility:visible;mso-wrap-style:square;mso-width-percent:0;mso-height-percent:0;mso-wrap-distance-left:9pt;mso-wrap-distance-top:0;mso-wrap-distance-right:9pt;mso-wrap-distance-bottom:0;mso-position-horizontal:absolute;mso-position-horizontal-relative:page;mso-position-vertical:absolute;mso-position-vertical-relative:page;mso-width-percent:0;mso-height-percent:0;mso-width-relative:page;mso-height-relative:page;v-text-anchor:top" o:gfxdata="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" filled="f" stroked="f">
               <v:textbox inset="0,0,0,0">
                 <w:txbxContent>
                   <w:p>
@@ -4430,7 +4430,10 @@
                       <w:fldChar w:fldCharType="separate"/>
                     </w:r>
                     <w:r>
-                      <w:t>3</w:t>
+                      <w:rPr>
+                        <w:noProof/>
+                      </w:rPr>
+                      <w:t>1</w:t>
                     </w:r>
                     <w:r>
                       <w:fldChar w:fldCharType="end"/>
@@ -4449,7 +4452,7 @@
 </file>
 
 <file path=word/footer3.xml><?xml version="1.0" encoding="utf-8"?>
-<w:ftr xmlns:wpc="http://schemas.microsoft.com/office/word/2010/wordprocessingCanvas" xmlns:cx="http://schemas.microsoft.com/office/drawing/2014/chartex" xmlns:cx1="http://schemas.microsoft.com/office/drawing/2015/9/8/chartex" xmlns:cx2="http://schemas.microsoft.com/office/drawing/2015/10/21/chartex" xmlns:cx3="http://schemas.microsoft.com/office/drawing/2016/5/9/chartex" xmlns:cx4="http://schemas.microsoft.com/office/drawing/2016/5/10/chartex" xmlns:cx5="http://schemas.microsoft.com/office/drawing/2016/5/11/chartex" xmlns:cx6="http://schemas.microsoft.com/office/drawing/2016/5/12/chartex" xmlns:cx7="http://schemas.microsoft.com/office/drawing/2016/5/13/chartex" xmlns:cx8="http://schemas.microsoft.com/office/drawing/2016/5/14/chartex" xmlns:mc="http://schemas.openxmlformats.org/markup-compatibility/2006" xmlns:aink="http://schemas.microsoft.com/office/drawing/2016/ink" xmlns:am3d="http://schemas.microsoft.com/office/drawing/2017/model3d" xmlns:o="urn:schemas-microsoft-com:office:office" xmlns:oel="http://schemas.microsoft.com/office/2019/extlst" xmlns:r="http://schemas.openxmlformats.org/officeDocument/2006/relationships" xmlns:m="http://schemas.openxmlformats.org/officeDocument/2006/math" xmlns:v="urn:schemas-microsoft-com:vml" xmlns:wp14="http://schemas.microsoft.com/office/word/2010/wordprocessingDrawing" xmlns:wp="http://schemas.openxmlformats.org/drawingml/2006/wordprocessingDrawing" xmlns:w10="urn:schemas-microsoft-com:office:word" xmlns:w="http://schemas.openxmlformats.org/wordprocessingml/2006/main" xmlns:w14="http://schemas.microsoft.com/office/word/2010/wordml" xmlns:w15="http://schemas.microsoft.com/office/word/2012/wordml" xmlns:w16cex="http://schemas.microsoft.com/office/word/2018/wordml/cex" xmlns:w16cid="http://schemas.microsoft.com/office/word/2016/wordml/cid" xmlns:w16="http://schemas.microsoft.com/office/word/2018/wordml" xmlns:w16du="http://schemas.microsoft.com/office/word/2023/wordml/word16du" xmlns:w16sdtdh="http://schemas.microsoft.com/office/word/2020/wordml/sdtdatahash" xmlns:w16sdtfl="http://schemas.microsoft.com/office/word/2024/wordml/sdtformatlock" xmlns:w16se="http://schemas.microsoft.com/office/word/2015/wordml/symex" xmlns:wpg="http://schemas.microsoft.com/office/word/2010/wordprocessingGroup" xmlns:wpi="http://schemas.microsoft.com/office/word/2010/wordprocessingInk" xmlns:wne="http://schemas.microsoft.com/office/word/2006/wordml" xmlns:wps="http://schemas.microsoft.com/office/word/2010/wordprocessingShape" mc:Ignorable="w14 w15 w16se w16cid w16 w16cex w16sdtdh w16sdtfl w16du wp14">
+<w:ftr xmlns:wpc="http://schemas.microsoft.com/office/word/2010/wordprocessingCanvas" xmlns:cx="http://schemas.microsoft.com/office/drawing/2014/chartex" xmlns:cx1="http://schemas.microsoft.com/office/drawing/2015/9/8/chartex" xmlns:mc="http://schemas.openxmlformats.org/markup-compatibility/2006" xmlns:o="urn:schemas-microsoft-com:office:office" xmlns:r="http://schemas.openxmlformats.org/officeDocument/2006/relationships" xmlns:m="http://schemas.openxmlformats.org/officeDocument/2006/math" xmlns:v="urn:schemas-microsoft-com:vml" xmlns:wp14="http://schemas.microsoft.com/office/word/2010/wordprocessingDrawing" xmlns:wp="http://schemas.openxmlformats.org/drawingml/2006/wordprocessingDrawing" xmlns:w10="urn:schemas-microsoft-com:office:word" xmlns:w="http://schemas.openxmlformats.org/wordprocessingml/2006/main" xmlns:w14="http://schemas.microsoft.com/office/word/2010/wordml" xmlns:w15="http://schemas.microsoft.com/office/word/2012/wordml" xmlns:w16se="http://schemas.microsoft.com/office/word/2015/wordml/symex" xmlns:wpg="http://schemas.microsoft.com/office/word/2010/wordprocessingGroup" xmlns:wpi="http://schemas.microsoft.com/office/word/2010/wordprocessingInk" xmlns:wne="http://schemas.microsoft.com/office/word/2006/wordml" xmlns:wps="http://schemas.microsoft.com/office/word/2010/wordprocessingShape" mc:Ignorable="w14 w15 w16se wp14">
   <w:p>
     <w:pPr>
       <w:pStyle w:val="Piedepgina"/>
@@ -4457,6 +4460,7 @@
     <w:r>
       <w:rPr>
         <w:noProof/>
+        <w:lang w:val="en-US" w:eastAsia="en-US" w:bidi="ar-SA"/>
       </w:rPr>
       <mc:AlternateContent>
         <mc:Choice Requires="wps">
@@ -4475,7 +4479,7 @@
               <wp:docPr id="2057738922" name="Cuadro de texto 1" descr="***Este documento está clasificado como PUBLICO por TELEFÓNICA.&#10;***This document is classified as PUBLIC by TELEFÓNICA.">
                 <a:extLst xmlns:a="http://schemas.openxmlformats.org/drawingml/2006/main">
                   <a:ext uri="{5AE41FA2-C0FF-4470-9BD4-5FADCA87CBE2}">
-                    <aclsh:classification xmlns:aclsh="http://schemas.microsoft.com/office/drawing/2020/classificationShape" classificationOutcomeType="ftr"/>
+                    <aclsh:classification xmlns:aclsh="http://schemas.microsoft.com/office/drawing/2020/classificationShape" xmlns:w16sdtfl="http://schemas.microsoft.com/office/word/2024/wordml/sdtformatlock" xmlns:w16sdtdh="http://schemas.microsoft.com/office/word/2020/wordml/sdtdatahash" xmlns:w16du="http://schemas.microsoft.com/office/word/2023/wordml/word16du" xmlns:w16="http://schemas.microsoft.com/office/word/2018/wordml" xmlns:w16cid="http://schemas.microsoft.com/office/word/2016/wordml/cid" xmlns:w16cex="http://schemas.microsoft.com/office/word/2018/wordml/cex" xmlns:w="http://schemas.openxmlformats.org/wordprocessingml/2006/main" xmlns:w10="urn:schemas-microsoft-com:office:word" xmlns:v="urn:schemas-microsoft-com:vml" xmlns:oel="http://schemas.microsoft.com/office/2019/extlst" xmlns:o="urn:schemas-microsoft-com:office:office" xmlns:am3d="http://schemas.microsoft.com/office/drawing/2017/model3d" xmlns:aink="http://schemas.microsoft.com/office/drawing/2016/ink" xmlns:cx8="http://schemas.microsoft.com/office/drawing/2016/5/14/chartex" xmlns:cx7="http://schemas.microsoft.com/office/drawing/2016/5/13/chartex" xmlns:cx6="http://schemas.microsoft.com/office/drawing/2016/5/12/chartex" xmlns:cx5="http://schemas.microsoft.com/office/drawing/2016/5/11/chartex" xmlns:cx4="http://schemas.microsoft.com/office/drawing/2016/5/10/chartex" xmlns:cx3="http://schemas.microsoft.com/office/drawing/2016/5/9/chartex" xmlns:cx2="http://schemas.microsoft.com/office/drawing/2015/10/21/chartex" xmlns="" classificationOutcomeType="ftr"/>
                   </a:ext>
                 </a:extLst>
               </wp:docPr>
@@ -4553,7 +4557,7 @@
             </wp:anchor>
           </w:drawing>
         </mc:Choice>
-        <mc:Fallback>
+        <mc:Fallback xmlns:w16sdtfl="http://schemas.microsoft.com/office/word/2024/wordml/sdtformatlock" xmlns:w16sdtdh="http://schemas.microsoft.com/office/word/2020/wordml/sdtdatahash" xmlns:w16du="http://schemas.microsoft.com/office/word/2023/wordml/word16du" xmlns:w16="http://schemas.microsoft.com/office/word/2018/wordml" xmlns:w16cid="http://schemas.microsoft.com/office/word/2016/wordml/cid" xmlns:w16cex="http://schemas.microsoft.com/office/word/2018/wordml/cex" xmlns:oel="http://schemas.microsoft.com/office/2019/extlst" xmlns:am3d="http://schemas.microsoft.com/office/drawing/2017/model3d" xmlns:aink="http://schemas.microsoft.com/office/drawing/2016/ink" xmlns:cx8="http://schemas.microsoft.com/office/drawing/2016/5/14/chartex" xmlns:cx7="http://schemas.microsoft.com/office/drawing/2016/5/13/chartex" xmlns:cx6="http://schemas.microsoft.com/office/drawing/2016/5/12/chartex" xmlns:cx5="http://schemas.microsoft.com/office/drawing/2016/5/11/chartex" xmlns:cx4="http://schemas.microsoft.com/office/drawing/2016/5/10/chartex" xmlns:cx3="http://schemas.microsoft.com/office/drawing/2016/5/9/chartex" xmlns:cx2="http://schemas.microsoft.com/office/drawing/2015/10/21/chartex">
           <w:pict>
             <v:shapetype w14:anchorId="69DFF95A" id="_x0000_t202" coordsize="21600,21600" o:spt="202" path="m,l,21600r21600,l21600,xe">
               <v:stroke joinstyle="miter"/>
@@ -4615,7 +4619,7 @@
 </file>
 
 <file path=word/footnotes.xml><?xml version="1.0" encoding="utf-8"?>
-<w:footnotes xmlns:wpc="http://schemas.microsoft.com/office/word/2010/wordprocessingCanvas" xmlns:cx="http://schemas.microsoft.com/office/drawing/2014/chartex" xmlns:cx1="http://schemas.microsoft.com/office/drawing/2015/9/8/chartex" xmlns:cx2="http://schemas.microsoft.com/office/drawing/2015/10/21/chartex" xmlns:cx3="http://schemas.microsoft.com/office/drawing/2016/5/9/chartex" xmlns:cx4="http://schemas.microsoft.com/office/drawing/2016/5/10/chartex" xmlns:cx5="http://schemas.microsoft.com/office/drawing/2016/5/11/chartex" xmlns:cx6="http://schemas.microsoft.com/office/drawing/2016/5/12/chartex" xmlns:cx7="http://schemas.microsoft.com/office/drawing/2016/5/13/chartex" xmlns:cx8="http://schemas.microsoft.com/office/drawing/2016/5/14/chartex" xmlns:mc="http://schemas.openxmlformats.org/markup-compatibility/2006" xmlns:aink="http://schemas.microsoft.com/office/drawing/2016/ink" xmlns:am3d="http://schemas.microsoft.com/office/drawing/2017/model3d" xmlns:o="urn:schemas-microsoft-com:office:office" xmlns:oel="http://schemas.microsoft.com/office/2019/extlst" xmlns:r="http://schemas.openxmlformats.org/officeDocument/2006/relationships" xmlns:m="http://schemas.openxmlformats.org/officeDocument/2006/math" xmlns:v="urn:schemas-microsoft-com:vml" xmlns:wp14="http://schemas.microsoft.com/office/word/2010/wordprocessingDrawing" xmlns:wp="http://schemas.openxmlformats.org/drawingml/2006/wordprocessingDrawing" xmlns:w10="urn:schemas-microsoft-com:office:word" xmlns:w="http://schemas.openxmlformats.org/wordprocessingml/2006/main" xmlns:w14="http://schemas.microsoft.com/office/word/2010/wordml" xmlns:w15="http://schemas.microsoft.com/office/word/2012/wordml" xmlns:w16cex="http://schemas.microsoft.com/office/word/2018/wordml/cex" xmlns:w16cid="http://schemas.microsoft.com/office/word/2016/wordml/cid" xmlns:w16="http://schemas.microsoft.com/office/word/2018/wordml" xmlns:w16du="http://schemas.microsoft.com/office/word/2023/wordml/word16du" xmlns:w16sdtdh="http://schemas.microsoft.com/office/word/2020/wordml/sdtdatahash" xmlns:w16sdtfl="http://schemas.microsoft.com/office/word/2024/wordml/sdtformatlock" xmlns:w16se="http://schemas.microsoft.com/office/word/2015/wordml/symex" xmlns:wpg="http://schemas.microsoft.com/office/word/2010/wordprocessingGroup" xmlns:wpi="http://schemas.microsoft.com/office/word/2010/wordprocessingInk" xmlns:wne="http://schemas.microsoft.com/office/word/2006/wordml" xmlns:wps="http://schemas.microsoft.com/office/word/2010/wordprocessingShape" mc:Ignorable="w14 w15 w16se w16cid w16 w16cex w16sdtdh w16sdtfl w16du wp14">
+<w:footnotes xmlns:wpc="http://schemas.microsoft.com/office/word/2010/wordprocessingCanvas" xmlns:cx="http://schemas.microsoft.com/office/drawing/2014/chartex" xmlns:cx1="http://schemas.microsoft.com/office/drawing/2015/9/8/chartex" xmlns:mc="http://schemas.openxmlformats.org/markup-compatibility/2006" xmlns:o="urn:schemas-microsoft-com:office:office" xmlns:r="http://schemas.openxmlformats.org/officeDocument/2006/relationships" xmlns:m="http://schemas.openxmlformats.org/officeDocument/2006/math" xmlns:v="urn:schemas-microsoft-com:vml" xmlns:wp14="http://schemas.microsoft.com/office/word/2010/wordprocessingDrawing" xmlns:wp="http://schemas.openxmlformats.org/drawingml/2006/wordprocessingDrawing" xmlns:w10="urn:schemas-microsoft-com:office:word" xmlns:w="http://schemas.openxmlformats.org/wordprocessingml/2006/main" xmlns:w14="http://schemas.microsoft.com/office/word/2010/wordml" xmlns:w15="http://schemas.microsoft.com/office/word/2012/wordml" xmlns:w16se="http://schemas.microsoft.com/office/word/2015/wordml/symex" xmlns:wpg="http://schemas.microsoft.com/office/word/2010/wordprocessingGroup" xmlns:wpi="http://schemas.microsoft.com/office/word/2010/wordprocessingInk" xmlns:wne="http://schemas.microsoft.com/office/word/2006/wordml" xmlns:wps="http://schemas.microsoft.com/office/word/2010/wordprocessingShape" mc:Ignorable="w14 w15 w16se wp14">
   <w:footnote w:type="separator" w:id="-1">
     <w:p>
       <w:r>
@@ -4901,7 +4905,7 @@
 </file>
 
 <file path=word/numbering.xml><?xml version="1.0" encoding="utf-8"?>
-<w:numbering xmlns:wpc="http://schemas.microsoft.com/office/word/2010/wordprocessingCanvas" xmlns:cx="http://schemas.microsoft.com/office/drawing/2014/chartex" xmlns:cx1="http://schemas.microsoft.com/office/drawing/2015/9/8/chartex" xmlns:cx2="http://schemas.microsoft.com/office/drawing/2015/10/21/chartex" xmlns:cx3="http://schemas.microsoft.com/office/drawing/2016/5/9/chartex" xmlns:cx4="http://schemas.microsoft.com/office/drawing/2016/5/10/chartex" xmlns:cx5="http://schemas.microsoft.com/office/drawing/2016/5/11/chartex" xmlns:cx6="http://schemas.microsoft.com/office/drawing/2016/5/12/chartex" xmlns:cx7="http://schemas.microsoft.com/office/drawing/2016/5/13/chartex" xmlns:cx8="http://schemas.microsoft.com/office/drawing/2016/5/14/chartex" xmlns:mc="http://schemas.openxmlformats.org/markup-compatibility/2006" xmlns:aink="http://schemas.microsoft.com/office/drawing/2016/ink" xmlns:am3d="http://schemas.microsoft.com/office/drawing/2017/model3d" xmlns:o="urn:schemas-microsoft-com:office:office" xmlns:oel="http://schemas.microsoft.com/office/2019/extlst" xmlns:r="http://schemas.openxmlformats.org/officeDocument/2006/relationships" xmlns:m="http://schemas.openxmlformats.org/officeDocument/2006/math" xmlns:v="urn:schemas-microsoft-com:vml" xmlns:wp14="http://schemas.microsoft.com/office/word/2010/wordprocessingDrawing" xmlns:wp="http://schemas.openxmlformats.org/drawingml/2006/wordprocessingDrawing" xmlns:w10="urn:schemas-microsoft-com:office:word" xmlns:w="http://schemas.openxmlformats.org/wordprocessingml/2006/main" xmlns:w14="http://schemas.microsoft.com/office/word/2010/wordml" xmlns:w15="http://schemas.microsoft.com/office/word/2012/wordml" xmlns:w16cex="http://schemas.microsoft.com/office/word/2018/wordml/cex" xmlns:w16cid="http://schemas.microsoft.com/office/word/2016/wordml/cid" xmlns:w16="http://schemas.microsoft.com/office/word/2018/wordml" xmlns:w16du="http://schemas.microsoft.com/office/word/2023/wordml/word16du" xmlns:w16sdtdh="http://schemas.microsoft.com/office/word/2020/wordml/sdtdatahash" xmlns:w16sdtfl="http://schemas.microsoft.com/office/word/2024/wordml/sdtformatlock" xmlns:w16se="http://schemas.microsoft.com/office/word/2015/wordml/symex" xmlns:wpg="http://schemas.microsoft.com/office/word/2010/wordprocessingGroup" xmlns:wpi="http://schemas.microsoft.com/office/word/2010/wordprocessingInk" xmlns:wne="http://schemas.microsoft.com/office/word/2006/wordml" xmlns:wps="http://schemas.microsoft.com/office/word/2010/wordprocessingShape" mc:Ignorable="w14 w15 w16se w16cid w16 w16cex w16sdtdh w16sdtfl w16du wp14">
+<w:numbering xmlns:wpc="http://schemas.microsoft.com/office/word/2010/wordprocessingCanvas" xmlns:cx="http://schemas.microsoft.com/office/drawing/2014/chartex" xmlns:cx1="http://schemas.microsoft.com/office/drawing/2015/9/8/chartex" xmlns:mc="http://schemas.openxmlformats.org/markup-compatibility/2006" xmlns:o="urn:schemas-microsoft-com:office:office" xmlns:r="http://schemas.openxmlformats.org/officeDocument/2006/relationships" xmlns:m="http://schemas.openxmlformats.org/officeDocument/2006/math" xmlns:v="urn:schemas-microsoft-com:vml" xmlns:wp14="http://schemas.microsoft.com/office/word/2010/wordprocessingDrawing" xmlns:wp="http://schemas.openxmlformats.org/drawingml/2006/wordprocessingDrawing" xmlns:w10="urn:schemas-microsoft-com:office:word" xmlns:w="http://schemas.openxmlformats.org/wordprocessingml/2006/main" xmlns:w14="http://schemas.microsoft.com/office/word/2010/wordml" xmlns:w15="http://schemas.microsoft.com/office/word/2012/wordml" xmlns:w16se="http://schemas.microsoft.com/office/word/2015/wordml/symex" xmlns:wpg="http://schemas.microsoft.com/office/word/2010/wordprocessingGroup" xmlns:wpi="http://schemas.microsoft.com/office/word/2010/wordprocessingInk" xmlns:wne="http://schemas.microsoft.com/office/word/2006/wordml" xmlns:wps="http://schemas.microsoft.com/office/word/2010/wordprocessingShape" mc:Ignorable="w14 w15 w16se wp14">
   <w:abstractNum w:abstractNumId="0" w15:restartNumberingAfterBreak="0">
     <w:nsid w:val="08886FF0"/>
     <w:multiLevelType w:val="hybridMultilevel"/>
@@ -5518,19 +5522,19 @@
       </w:pPr>
     </w:lvl>
   </w:abstractNum>
-  <w:num w:numId="1" w16cid:durableId="1419986781">
+  <w:num w:numId="1">
     <w:abstractNumId w:val="6"/>
   </w:num>
-  <w:num w:numId="2" w16cid:durableId="1011949708">
+  <w:num w:numId="2">
     <w:abstractNumId w:val="3"/>
   </w:num>
-  <w:num w:numId="3" w16cid:durableId="527376640">
+  <w:num w:numId="3">
     <w:abstractNumId w:val="0"/>
   </w:num>
-  <w:num w:numId="4" w16cid:durableId="939530740">
+  <w:num w:numId="4">
     <w:abstractNumId w:val="4"/>
   </w:num>
-  <w:num w:numId="5" w16cid:durableId="806094189">
+  <w:num w:numId="5">
     <w:abstractNumId w:val="5"/>
     <w:lvlOverride w:ilvl="0">
       <w:startOverride w:val="1"/>
@@ -5560,10 +5564,10 @@
       <w:startOverride w:val="1"/>
     </w:lvlOverride>
   </w:num>
-  <w:num w:numId="6" w16cid:durableId="436606515">
+  <w:num w:numId="6">
     <w:abstractNumId w:val="2"/>
   </w:num>
-  <w:num w:numId="7" w16cid:durableId="442237676">
+  <w:num w:numId="7">
     <w:abstractNumId w:val="1"/>
     <w:lvlOverride w:ilvl="0">
       <w:startOverride w:val="1"/>
@@ -5593,14 +5597,14 @@
       <w:startOverride w:val="1"/>
     </w:lvlOverride>
   </w:num>
-  <w:num w:numId="8" w16cid:durableId="1977100950">
+  <w:num w:numId="8">
     <w:abstractNumId w:val="2"/>
   </w:num>
 </w:numbering>
 </file>
 
 <file path=word/styles.xml><?xml version="1.0" encoding="utf-8"?>
-<w:styles xmlns:mc="http://schemas.openxmlformats.org/markup-compatibility/2006" xmlns:r="http://schemas.openxmlformats.org/officeDocument/2006/relationships" xmlns:w="http://schemas.openxmlformats.org/wordprocessingml/2006/main" xmlns:w14="http://schemas.microsoft.com/office/word/2010/wordml" xmlns:w15="http://schemas.microsoft.com/office/word/2012/wordml" xmlns:w16cex="http://schemas.microsoft.com/office/word/2018/wordml/cex" xmlns:w16cid="http://schemas.microsoft.com/office/word/2016/wordml/cid" xmlns:w16="http://schemas.microsoft.com/office/word/2018/wordml" xmlns:w16du="http://schemas.microsoft.com/office/word/2023/wordml/word16du" xmlns:w16sdtdh="http://schemas.microsoft.com/office/word/2020/wordml/sdtdatahash" xmlns:w16sdtfl="http://schemas.microsoft.com/office/word/2024/wordml/sdtformatlock" xmlns:w16se="http://schemas.microsoft.com/office/word/2015/wordml/symex" mc:Ignorable="w14 w15 w16se w16cid w16 w16cex w16sdtdh w16sdtfl w16du">
+<w:styles xmlns:mc="http://schemas.openxmlformats.org/markup-compatibility/2006" xmlns:r="http://schemas.openxmlformats.org/officeDocument/2006/relationships" xmlns:w="http://schemas.openxmlformats.org/wordprocessingml/2006/main" xmlns:w14="http://schemas.microsoft.com/office/word/2010/wordml" xmlns:w15="http://schemas.microsoft.com/office/word/2012/wordml" xmlns:w16se="http://schemas.microsoft.com/office/word/2015/wordml/symex" mc:Ignorable="w14 w15 w16se">
   <w:docDefaults>
     <w:rPrDefault>
       <w:rPr>
@@ -5618,7 +5622,7 @@
       </w:pPr>
     </w:pPrDefault>
   </w:docDefaults>
-  <w:latentStyles w:defLockedState="0" w:defUIPriority="99" w:defSemiHidden="0" w:defUnhideWhenUsed="0" w:defQFormat="0" w:count="376">
+  <w:latentStyles w:defLockedState="0" w:defUIPriority="99" w:defSemiHidden="0" w:defUnhideWhenUsed="0" w:defQFormat="0" w:count="371">
     <w:lsdException w:name="Normal" w:uiPriority="0" w:qFormat="1"/>
     <w:lsdException w:name="heading 1" w:uiPriority="9" w:qFormat="1"/>
     <w:lsdException w:name="heading 2" w:semiHidden="1" w:uiPriority="9" w:unhideWhenUsed="1" w:qFormat="1"/>
@@ -5990,11 +5994,6 @@
     <w:lsdException w:name="List Table 5 Dark Accent 6" w:uiPriority="50"/>
     <w:lsdException w:name="List Table 6 Colorful Accent 6" w:uiPriority="51"/>
     <w:lsdException w:name="List Table 7 Colorful Accent 6" w:uiPriority="52"/>
-    <w:lsdException w:name="Mention" w:semiHidden="1" w:unhideWhenUsed="1"/>
-    <w:lsdException w:name="Smart Hyperlink" w:semiHidden="1" w:unhideWhenUsed="1"/>
-    <w:lsdException w:name="Hashtag" w:semiHidden="1" w:unhideWhenUsed="1"/>
-    <w:lsdException w:name="Unresolved Mention" w:semiHidden="1" w:unhideWhenUsed="1"/>
-    <w:lsdException w:name="Smart Link" w:semiHidden="1" w:unhideWhenUsed="1"/>
   </w:latentStyles>
   <w:style w:type="paragraph" w:default="1" w:styleId="Normal">
     <w:name w:val="Normal"/>
@@ -6569,25 +6568,6 @@
 </file>
 
 <file path=customXml/item1.xml><?xml version="1.0" encoding="utf-8"?>
-<p:properties xmlns:p="http://schemas.microsoft.com/office/2006/metadata/properties" xmlns:xsi="http://www.w3.org/2001/XMLSchema-instance" xmlns:pc="http://schemas.microsoft.com/office/infopath/2007/PartnerControls">
-  <documentManagement/>
-</p:properties>
-</file>
-
-<file path=customXml/item2.xml><?xml version="1.0" encoding="utf-8"?>
-<?mso-contentType ?>
-<FormTemplates xmlns="http://schemas.microsoft.com/sharepoint/v3/contenttype/forms">
-  <Display>DocumentLibraryForm</Display>
-  <Edit>DocumentLibraryForm</Edit>
-  <New>DocumentLibraryForm</New>
-</FormTemplates>
-</file>
-
-<file path=customXml/item3.xml><?xml version="1.0" encoding="utf-8"?>
-<b:Sources xmlns:b="http://schemas.openxmlformats.org/officeDocument/2006/bibliography" xmlns="http://schemas.openxmlformats.org/officeDocument/2006/bibliography" SelectedStyle="\APASixthEditionOfficeOnline.xsl" StyleName="APA" Version="6"/>
-</file>
-
-<file path=customXml/item4.xml><?xml version="1.0" encoding="utf-8"?>
 <ct:contentTypeSchema xmlns:ct="http://schemas.microsoft.com/office/2006/metadata/contentType" xmlns:ma="http://schemas.microsoft.com/office/2006/metadata/properties/metaAttributes" ct:_="" ma:_="" ma:contentTypeName="Document" ma:contentTypeID="0x010100B91CCA4B222D8949B08D8DD731AA5AF4" ma:contentTypeVersion="1" ma:contentTypeDescription="Create a new document." ma:contentTypeScope="" ma:versionID="70b84797dce572ef42fbf0f7afcd4060">
   <xsd:schema xmlns:xsd="http://www.w3.org/2001/XMLSchema" xmlns:xs="http://www.w3.org/2001/XMLSchema" xmlns:p="http://schemas.microsoft.com/office/2006/metadata/properties" xmlns:ns2="7c0914e4-2baf-41aa-8695-c677da8a6988" xmlns:ns3="39f93077-2e26-4efb-a310-64e6bcf1cac8" targetNamespace="http://schemas.microsoft.com/office/2006/metadata/properties" ma:root="true" ma:fieldsID="1eae6e72528d36f21057520e0181f7d1" ns2:_="" ns3:_="">
     <xsd:import namespace="7c0914e4-2baf-41aa-8695-c677da8a6988"/>
@@ -6764,32 +6744,26 @@
 </ct:contentTypeSchema>
 </file>
 
-<file path=customXml/itemProps1.xml><?xml version="1.0" encoding="utf-8"?>
-<ds:datastoreItem xmlns:ds="http://schemas.openxmlformats.org/officeDocument/2006/customXml" ds:itemID="{67E99444-F817-4CF5-AA89-71435942027B}">
-  <ds:schemaRefs>
-    <ds:schemaRef ds:uri="http://schemas.microsoft.com/office/2006/metadata/properties"/>
-    <ds:schemaRef ds:uri="http://schemas.microsoft.com/office/infopath/2007/PartnerControls"/>
-  </ds:schemaRefs>
-</ds:datastoreItem>
+<file path=customXml/item2.xml><?xml version="1.0" encoding="utf-8"?>
+<?mso-contentType ?>
+<FormTemplates xmlns="http://schemas.microsoft.com/sharepoint/v3/contenttype/forms">
+  <Display>DocumentLibraryForm</Display>
+  <Edit>DocumentLibraryForm</Edit>
+  <New>DocumentLibraryForm</New>
+</FormTemplates>
 </file>
 
-<file path=customXml/itemProps2.xml><?xml version="1.0" encoding="utf-8"?>
-<ds:datastoreItem xmlns:ds="http://schemas.openxmlformats.org/officeDocument/2006/customXml" ds:itemID="{44C69C6F-BF13-4F4E-81F5-B328237E2D8B}">
-  <ds:schemaRefs>
-    <ds:schemaRef ds:uri="http://schemas.microsoft.com/sharepoint/v3/contenttype/forms"/>
-  </ds:schemaRefs>
-</ds:datastoreItem>
+<file path=customXml/item3.xml><?xml version="1.0" encoding="utf-8"?>
+<p:properties xmlns:p="http://schemas.microsoft.com/office/2006/metadata/properties" xmlns:xsi="http://www.w3.org/2001/XMLSchema-instance" xmlns:pc="http://schemas.microsoft.com/office/infopath/2007/PartnerControls">
+  <documentManagement/>
+</p:properties>
 </file>
 
-<file path=customXml/itemProps3.xml><?xml version="1.0" encoding="utf-8"?>
-<ds:datastoreItem xmlns:ds="http://schemas.openxmlformats.org/officeDocument/2006/customXml" ds:itemID="{B7503D3E-F319-4C8C-A9AA-1DDB5E16EE1C}">
-  <ds:schemaRefs>
-    <ds:schemaRef ds:uri="http://schemas.openxmlformats.org/officeDocument/2006/bibliography"/>
-  </ds:schemaRefs>
-</ds:datastoreItem>
+<file path=customXml/item4.xml><?xml version="1.0" encoding="utf-8"?>
+<b:Sources xmlns:b="http://schemas.openxmlformats.org/officeDocument/2006/bibliography" xmlns="http://schemas.openxmlformats.org/officeDocument/2006/bibliography" SelectedStyle="\APASixthEditionOfficeOnline.xsl" StyleName="APA" Version="6"/>
 </file>
 
-<file path=customXml/itemProps4.xml><?xml version="1.0" encoding="utf-8"?>
+<file path=customXml/itemProps1.xml><?xml version="1.0" encoding="utf-8"?>
 <ds:datastoreItem xmlns:ds="http://schemas.openxmlformats.org/officeDocument/2006/customXml" ds:itemID="{B6D7EA76-C572-49B0-936A-72335B12DA44}">
   <ds:schemaRefs>
     <ds:schemaRef ds:uri="http://schemas.microsoft.com/office/2006/metadata/contentType"/>
@@ -6808,6 +6782,31 @@
 </ds:datastoreItem>
 </file>
 
+<file path=customXml/itemProps2.xml><?xml version="1.0" encoding="utf-8"?>
+<ds:datastoreItem xmlns:ds="http://schemas.openxmlformats.org/officeDocument/2006/customXml" ds:itemID="{44C69C6F-BF13-4F4E-81F5-B328237E2D8B}">
+  <ds:schemaRefs>
+    <ds:schemaRef ds:uri="http://schemas.microsoft.com/sharepoint/v3/contenttype/forms"/>
+  </ds:schemaRefs>
+</ds:datastoreItem>
+</file>
+
+<file path=customXml/itemProps3.xml><?xml version="1.0" encoding="utf-8"?>
+<ds:datastoreItem xmlns:ds="http://schemas.openxmlformats.org/officeDocument/2006/customXml" ds:itemID="{67E99444-F817-4CF5-AA89-71435942027B}">
+  <ds:schemaRefs>
+    <ds:schemaRef ds:uri="http://schemas.microsoft.com/office/2006/metadata/properties"/>
+    <ds:schemaRef ds:uri="http://schemas.microsoft.com/office/infopath/2007/PartnerControls"/>
+  </ds:schemaRefs>
+</ds:datastoreItem>
+</file>
+
+<file path=customXml/itemProps4.xml><?xml version="1.0" encoding="utf-8"?>
+<ds:datastoreItem xmlns:ds="http://schemas.openxmlformats.org/officeDocument/2006/customXml" ds:itemID="{B4132C40-6F59-4153-9EC0-C916B585A84A}">
+  <ds:schemaRefs>
+    <ds:schemaRef ds:uri="http://schemas.openxmlformats.org/officeDocument/2006/bibliography"/>
+  </ds:schemaRefs>
+</ds:datastoreItem>
+</file>
+
 <file path=docMetadata/LabelInfo.xml><?xml version="1.0" encoding="utf-8"?>
 <clbl:labelList xmlns:clbl="http://schemas.microsoft.com/office/2020/mipLabelMetadata">
   <clbl:label id="{42a05cd7-7d3d-491c-80c0-f65c4798d990}" enabled="1" method="Privileged" siteId="{17d02e16-8b83-4168-ba0d-c61ac0d093a6}" contentBits="0" removed="0"/>

</xml_diff>